<commit_message>
SASTT-8 Map required evidence and refresh report status
Add the 11-component document index and correct publication status in the review record and both Word reports. Main remains 14 pages; appendices 24. All 48 APA references per document are preserved and all pages visually checked. Genuine student, stakeholder and supervisor evidence remains pending.

Tasks: https://sales-analytics-stt-team.youtrack.cloud/issue/SASTT-8 and https://sales-analytics-stt-team.youtrack.cloud/issue/SASTT-1

Prepared with Codex assistance.
</commit_message>
<xml_diff>
--- a/docs/research_appendices.docx
+++ b/docs/research_appendices.docx
@@ -9242,7 +9242,7 @@
                 <w:color w:val="000000"/>
                 <w:sz w:val="18"/>
               </w:rPr>
-              <w:t>Publish prepared package and finish team access; repository created, reviews and access pending.</w:t>
+              <w:t>Package published through merged PRs; confirm teammate/reviewer access and independent review.</w:t>
             </w:r>
           </w:p>
         </w:tc>
@@ -9273,7 +9273,7 @@
                 <w:color w:val="000000"/>
                 <w:sz w:val="18"/>
               </w:rPr>
-              <w:t>24 Oct; repository only</w:t>
+              <w:t>24 Oct; access pending</w:t>
             </w:r>
           </w:p>
         </w:tc>
@@ -10551,7 +10551,7 @@
         <w:rPr>
           <w:color w:val="000000"/>
         </w:rPr>
-        <w:t>Setup status on 23 October 2026  Prepared materials are in draft PR 2 at https://github.com/ddigreen/sales-analytics-stt. The YouTrack project at https://sales-analytics-stt-team.youtrack.cloud/projects/SASTT contains 12 assigned Open issues; planning/backlog.csv maps W labels to actual issue IDs. Dameli has GitHub access; Bekzat was invited. Student review, stakeholder evidence, supervision, reviewer access and a reviewed submission tag remain pending. Apply pre-defense-1 only to the actual reviewed submission.</w:t>
+        <w:t>Setup status on 23 October 2026  PRs 2–4 are merged at https://github.com/ddigreen/sales-analytics-stt. Demo: https://ddigreen.github.io/vocasales-demo/. PRs 3–4 have Codex-assisted technical reviews; independent student review is pending. YouTrack at https://sales-analytics-stt-team.youtrack.cloud/projects/SASTT has 12 assigned Open issues; planning/backlog.csv maps W labels to actual IDs. Dameli has GitHub access; Bekzat was invited. Stakeholder evidence, supervisor feedback and reviewer access remain pending. Apply pre-defense-1 only to the actual reviewed submission.</w:t>
       </w:r>
     </w:p>
     <w:p>
@@ -14187,7 +14187,7 @@
         <w:rPr>
           <w:color w:val="000000"/>
         </w:rPr>
-        <w:t>For current task links and remaining work, use planning/git_preparation.md and planning/checkpoint_checklist.md. The prepared package is in draft PR 2; YouTrack has real assigned issues. Technical source, data and prototype checks do not substitute for student PR review, supervisor feedback or representative-user evidence. Keep recordings and customer data outside source control.</w:t>
+        <w:t>For current task links and remaining work, use planning/git_preparation.md and planning/checkpoint_checklist.md. The prepared package is in main after PRs 2–4; YouTrack has real assigned issues. Technical source, data and prototype checks do not substitute for student PR review, supervisor feedback or representative-user evidence. Keep recordings and customer data outside source control.</w:t>
       </w:r>
     </w:p>
     <w:p>

</xml_diff>